<commit_message>
hydra and gobuster basics
</commit_message>
<xml_diff>
--- a/tools/basic tools.docx
+++ b/tools/basic tools.docx
@@ -1,6 +1,6 @@
 
 <file path=word/document.xml><?xml version="1.0" encoding="utf-8"?>
-<w:document xmlns:o="urn:schemas-microsoft-com:office:office" xmlns:r="http://schemas.openxmlformats.org/officeDocument/2006/relationships" xmlns:v="urn:schemas-microsoft-com:vml" xmlns:w="http://schemas.openxmlformats.org/wordprocessingml/2006/main" xmlns:w10="urn:schemas-microsoft-com:office:word" xmlns:wp="http://schemas.openxmlformats.org/drawingml/2006/wordprocessingDrawing" xmlns:wps="http://schemas.microsoft.com/office/word/2010/wordprocessingShape" xmlns:wpg="http://schemas.microsoft.com/office/word/2010/wordprocessingGroup" xmlns:mc="http://schemas.openxmlformats.org/markup-compatibility/2006" xmlns:wp14="http://schemas.microsoft.com/office/word/2010/wordprocessingDrawing" xmlns:w14="http://schemas.microsoft.com/office/word/2010/wordml" xmlns:w15="http://schemas.microsoft.com/office/word/2012/wordml" mc:Ignorable="w14 wp14 w15">
+<w:document xmlns:o="urn:schemas-microsoft-com:office:office" xmlns:r="http://schemas.openxmlformats.org/officeDocument/2006/relationships" xmlns:v="urn:schemas-microsoft-com:vml" xmlns:w="http://schemas.openxmlformats.org/wordprocessingml/2006/main" xmlns:w10="urn:schemas-microsoft-com:office:word" xmlns:wp="http://schemas.openxmlformats.org/drawingml/2006/wordprocessingDrawing" xmlns:pic="http://schemas.openxmlformats.org/drawingml/2006/picture" xmlns:wps="http://schemas.microsoft.com/office/word/2010/wordprocessingShape" xmlns:wpg="http://schemas.microsoft.com/office/word/2010/wordprocessingGroup" xmlns:mc="http://schemas.openxmlformats.org/markup-compatibility/2006" xmlns:wp14="http://schemas.microsoft.com/office/word/2010/wordprocessingDrawing" xmlns:w14="http://schemas.microsoft.com/office/word/2010/wordml" xmlns:w15="http://schemas.microsoft.com/office/word/2012/wordml" mc:Ignorable="w14 wp14 w15">
   <w:body>
     <w:p>
       <w:pPr>
@@ -1812,8 +1812,8 @@
       </w:tblPr>
       <w:tblGrid>
         <w:gridCol w:w="1001"/>
-        <w:gridCol w:w="3189"/>
-        <w:gridCol w:w="2403"/>
+        <w:gridCol w:w="3188"/>
+        <w:gridCol w:w="2404"/>
         <w:gridCol w:w="3045"/>
       </w:tblGrid>
       <w:tr>
@@ -1839,7 +1839,7 @@
         </w:tc>
         <w:tc>
           <w:tcPr>
-            <w:tcW w:w="3189" w:type="dxa"/>
+            <w:tcW w:w="3188" w:type="dxa"/>
             <w:tcBorders/>
             <w:vAlign w:val="center"/>
           </w:tcPr>
@@ -1856,7 +1856,7 @@
         </w:tc>
         <w:tc>
           <w:tcPr>
-            <w:tcW w:w="2403" w:type="dxa"/>
+            <w:tcW w:w="2404" w:type="dxa"/>
             <w:tcBorders/>
             <w:vAlign w:val="center"/>
           </w:tcPr>
@@ -1910,7 +1910,7 @@
         </w:tc>
         <w:tc>
           <w:tcPr>
-            <w:tcW w:w="3189" w:type="dxa"/>
+            <w:tcW w:w="3188" w:type="dxa"/>
             <w:tcBorders/>
             <w:vAlign w:val="center"/>
           </w:tcPr>
@@ -1927,7 +1927,7 @@
         </w:tc>
         <w:tc>
           <w:tcPr>
-            <w:tcW w:w="2403" w:type="dxa"/>
+            <w:tcW w:w="2404" w:type="dxa"/>
             <w:tcBorders/>
             <w:vAlign w:val="center"/>
           </w:tcPr>
@@ -1981,7 +1981,7 @@
         </w:tc>
         <w:tc>
           <w:tcPr>
-            <w:tcW w:w="3189" w:type="dxa"/>
+            <w:tcW w:w="3188" w:type="dxa"/>
             <w:tcBorders/>
             <w:vAlign w:val="center"/>
           </w:tcPr>
@@ -1998,7 +1998,7 @@
         </w:tc>
         <w:tc>
           <w:tcPr>
-            <w:tcW w:w="2403" w:type="dxa"/>
+            <w:tcW w:w="2404" w:type="dxa"/>
             <w:tcBorders/>
             <w:vAlign w:val="center"/>
           </w:tcPr>
@@ -2052,7 +2052,7 @@
         </w:tc>
         <w:tc>
           <w:tcPr>
-            <w:tcW w:w="3189" w:type="dxa"/>
+            <w:tcW w:w="3188" w:type="dxa"/>
             <w:tcBorders/>
             <w:vAlign w:val="center"/>
           </w:tcPr>
@@ -2069,7 +2069,7 @@
         </w:tc>
         <w:tc>
           <w:tcPr>
-            <w:tcW w:w="2403" w:type="dxa"/>
+            <w:tcW w:w="2404" w:type="dxa"/>
             <w:tcBorders/>
             <w:vAlign w:val="center"/>
           </w:tcPr>
@@ -2123,7 +2123,7 @@
         </w:tc>
         <w:tc>
           <w:tcPr>
-            <w:tcW w:w="3189" w:type="dxa"/>
+            <w:tcW w:w="3188" w:type="dxa"/>
             <w:tcBorders/>
             <w:vAlign w:val="center"/>
           </w:tcPr>
@@ -2140,7 +2140,7 @@
         </w:tc>
         <w:tc>
           <w:tcPr>
-            <w:tcW w:w="2403" w:type="dxa"/>
+            <w:tcW w:w="2404" w:type="dxa"/>
             <w:tcBorders/>
             <w:vAlign w:val="center"/>
           </w:tcPr>
@@ -2194,7 +2194,7 @@
         </w:tc>
         <w:tc>
           <w:tcPr>
-            <w:tcW w:w="3189" w:type="dxa"/>
+            <w:tcW w:w="3188" w:type="dxa"/>
             <w:tcBorders/>
             <w:vAlign w:val="center"/>
           </w:tcPr>
@@ -2211,7 +2211,7 @@
         </w:tc>
         <w:tc>
           <w:tcPr>
-            <w:tcW w:w="2403" w:type="dxa"/>
+            <w:tcW w:w="2404" w:type="dxa"/>
             <w:tcBorders/>
             <w:vAlign w:val="center"/>
           </w:tcPr>
@@ -2265,7 +2265,7 @@
         </w:tc>
         <w:tc>
           <w:tcPr>
-            <w:tcW w:w="3189" w:type="dxa"/>
+            <w:tcW w:w="3188" w:type="dxa"/>
             <w:tcBorders/>
             <w:vAlign w:val="center"/>
           </w:tcPr>
@@ -2282,7 +2282,7 @@
         </w:tc>
         <w:tc>
           <w:tcPr>
-            <w:tcW w:w="2403" w:type="dxa"/>
+            <w:tcW w:w="2404" w:type="dxa"/>
             <w:tcBorders/>
             <w:vAlign w:val="center"/>
           </w:tcPr>
@@ -2336,7 +2336,7 @@
         </w:tc>
         <w:tc>
           <w:tcPr>
-            <w:tcW w:w="3189" w:type="dxa"/>
+            <w:tcW w:w="3188" w:type="dxa"/>
             <w:tcBorders/>
             <w:vAlign w:val="center"/>
           </w:tcPr>
@@ -2353,7 +2353,7 @@
         </w:tc>
         <w:tc>
           <w:tcPr>
-            <w:tcW w:w="2403" w:type="dxa"/>
+            <w:tcW w:w="2404" w:type="dxa"/>
             <w:tcBorders/>
             <w:vAlign w:val="center"/>
           </w:tcPr>
@@ -2407,7 +2407,7 @@
         </w:tc>
         <w:tc>
           <w:tcPr>
-            <w:tcW w:w="3189" w:type="dxa"/>
+            <w:tcW w:w="3188" w:type="dxa"/>
             <w:tcBorders/>
             <w:vAlign w:val="center"/>
           </w:tcPr>
@@ -2424,7 +2424,7 @@
         </w:tc>
         <w:tc>
           <w:tcPr>
-            <w:tcW w:w="2403" w:type="dxa"/>
+            <w:tcW w:w="2404" w:type="dxa"/>
             <w:tcBorders/>
             <w:vAlign w:val="center"/>
           </w:tcPr>
@@ -2458,6 +2458,793 @@
         </w:tc>
       </w:tr>
     </w:tbl>
+    <w:p>
+      <w:pPr>
+        <w:pStyle w:val="Normal"/>
+        <w:bidi w:val="0"/>
+        <w:jc w:val="left"/>
+        <w:rPr/>
+      </w:pPr>
+      <w:r>
+        <w:rPr/>
+      </w:r>
+    </w:p>
+    <w:p>
+      <w:pPr>
+        <w:pStyle w:val="Normal"/>
+        <w:bidi w:val="0"/>
+        <w:jc w:val="left"/>
+        <w:rPr/>
+      </w:pPr>
+      <w:r>
+        <w:rPr/>
+      </w:r>
+    </w:p>
+    <w:p>
+      <w:pPr>
+        <w:pStyle w:val="Normal"/>
+        <w:bidi w:val="0"/>
+        <w:jc w:val="left"/>
+        <w:rPr/>
+      </w:pPr>
+      <w:r>
+        <w:rPr/>
+      </w:r>
+    </w:p>
+    <w:p>
+      <w:pPr>
+        <w:pStyle w:val="Normal"/>
+        <w:bidi w:val="0"/>
+        <w:jc w:val="left"/>
+        <w:rPr/>
+      </w:pPr>
+      <w:r>
+        <w:rPr/>
+      </w:r>
+    </w:p>
+    <w:p>
+      <w:pPr>
+        <w:pStyle w:val="Normal"/>
+        <w:bidi w:val="0"/>
+        <w:jc w:val="left"/>
+        <w:rPr/>
+      </w:pPr>
+      <w:r>
+        <w:rPr/>
+      </w:r>
+    </w:p>
+    <w:p>
+      <w:pPr>
+        <w:pStyle w:val="BodyText"/>
+        <w:bidi w:val="0"/>
+        <w:spacing w:lineRule="auto" w:line="274" w:before="0" w:after="140"/>
+        <w:ind w:hanging="0" w:left="0" w:right="0"/>
+        <w:jc w:val="left"/>
+        <w:rPr/>
+      </w:pPr>
+      <w:bookmarkStart w:id="0" w:name="p-rc_669a3282ae64586a-23"/>
+      <w:bookmarkEnd w:id="0"/>
+      <w:r>
+        <w:rPr>
+          <w:rStyle w:val="SourceText"/>
+          <w:rFonts w:ascii="Google Sans Text;sans-serif" w:hAnsi="Google Sans Text;sans-serif"/>
+          <w:b/>
+        </w:rPr>
+        <w:t>curl</w:t>
+      </w:r>
+      <w:r>
+        <w:rPr>
+          <w:rFonts w:ascii="Google Sans Text;sans-serif" w:hAnsi="Google Sans Text;sans-serif"/>
+        </w:rPr>
+        <w:t xml:space="preserve"> (short for "Client URL") is a highly versatile command-line tool used to transfer data to or from a server over a network.</w:t>
+      </w:r>
+    </w:p>
+    <w:p>
+      <w:pPr>
+        <w:pStyle w:val="BodyText"/>
+        <w:spacing w:lineRule="auto" w:line="274" w:before="0" w:after="140"/>
+        <w:ind w:hanging="0" w:left="0" w:right="0"/>
+        <w:rPr/>
+      </w:pPr>
+      <w:r>
+        <w:rPr>
+          <w:rFonts w:ascii="Google Sans Text;sans-serif" w:hAnsi="Google Sans Text;sans-serif"/>
+        </w:rPr>
+        <w:t xml:space="preserve">Think of it as a web browser without a graphical interface. Instead of rendering a webpage with images and CSS, </w:t>
+      </w:r>
+      <w:r>
+        <w:rPr>
+          <w:rStyle w:val="SourceText"/>
+          <w:rFonts w:ascii="Google Sans Text;sans-serif" w:hAnsi="Google Sans Text;sans-serif"/>
+        </w:rPr>
+        <w:t>curl</w:t>
+      </w:r>
+      <w:r>
+        <w:rPr>
+          <w:rFonts w:ascii="Google Sans Text;sans-serif" w:hAnsi="Google Sans Text;sans-serif"/>
+        </w:rPr>
+        <w:t xml:space="preserve"> grabs the raw data (like HTML, JSON, or files) and spits it out directly into your terminal.</w:t>
+      </w:r>
+    </w:p>
+    <w:p>
+      <w:pPr>
+        <w:pStyle w:val="BodyText"/>
+        <w:spacing w:lineRule="auto" w:line="274" w:before="0" w:after="140"/>
+        <w:ind w:hanging="0" w:left="0" w:right="0"/>
+        <w:rPr/>
+      </w:pPr>
+      <w:r>
+        <w:rPr>
+          <w:rFonts w:ascii="Google Sans Text;sans-serif" w:hAnsi="Google Sans Text;sans-serif"/>
+        </w:rPr>
+        <w:t xml:space="preserve">Because you are working in Kali Linux and doing TryHackMe rooms, </w:t>
+      </w:r>
+      <w:r>
+        <w:rPr>
+          <w:rStyle w:val="SourceText"/>
+          <w:rFonts w:ascii="Google Sans Text;sans-serif" w:hAnsi="Google Sans Text;sans-serif"/>
+        </w:rPr>
+        <w:t>curl</w:t>
+      </w:r>
+      <w:r>
+        <w:rPr>
+          <w:rFonts w:ascii="Google Sans Text;sans-serif" w:hAnsi="Google Sans Text;sans-serif"/>
+        </w:rPr>
+        <w:t xml:space="preserve"> will be one of the most important tools in your arsenal.</w:t>
+      </w:r>
+    </w:p>
+    <w:p>
+      <w:pPr>
+        <w:pStyle w:val="Heading3"/>
+        <w:spacing w:lineRule="auto" w:line="274" w:before="0" w:after="120"/>
+        <w:ind w:hanging="0" w:left="0" w:right="0"/>
+        <w:rPr>
+          <w:rFonts w:eastAsia="Noto Serif CJK SC"/>
+          <w:sz w:val="24"/>
+          <w:szCs w:val="24"/>
+        </w:rPr>
+      </w:pPr>
+      <w:r>
+        <w:rPr>
+          <w:rFonts w:eastAsia="Noto Serif CJK SC" w:ascii="Google Sans;sans-serif" w:hAnsi="Google Sans;sans-serif"/>
+          <w:sz w:val="24"/>
+          <w:szCs w:val="24"/>
+        </w:rPr>
+        <w:t xml:space="preserve">What is </w:t>
+      </w:r>
+      <w:r>
+        <w:rPr>
+          <w:rStyle w:val="SourceText"/>
+          <w:rFonts w:ascii="Google Sans Text;sans-serif" w:hAnsi="Google Sans Text;sans-serif"/>
+          <w:sz w:val="24"/>
+          <w:szCs w:val="24"/>
+        </w:rPr>
+        <w:t>curl</w:t>
+      </w:r>
+      <w:r>
+        <w:rPr>
+          <w:rFonts w:eastAsia="Noto Serif CJK SC" w:ascii="Google Sans;sans-serif" w:hAnsi="Google Sans;sans-serif"/>
+          <w:sz w:val="24"/>
+          <w:szCs w:val="24"/>
+        </w:rPr>
+        <w:t xml:space="preserve"> mainly used for?</w:t>
+      </w:r>
+    </w:p>
+    <w:p>
+      <w:pPr>
+        <w:pStyle w:val="BodyText"/>
+        <w:numPr>
+          <w:ilvl w:val="0"/>
+          <w:numId w:val="17"/>
+        </w:numPr>
+        <w:pBdr/>
+        <w:tabs>
+          <w:tab w:val="clear" w:pos="709"/>
+          <w:tab w:val="left" w:pos="0" w:leader="none"/>
+        </w:tabs>
+        <w:spacing w:lineRule="auto" w:line="274" w:before="0" w:after="140"/>
+        <w:ind w:hanging="283" w:left="709" w:right="0"/>
+        <w:rPr>
+          <w:rFonts w:ascii="Google Sans Text;sans-serif" w:hAnsi="Google Sans Text;sans-serif"/>
+        </w:rPr>
+      </w:pPr>
+      <w:bookmarkStart w:id="1" w:name="p-rc_669a3282ae64586a-24"/>
+      <w:bookmarkEnd w:id="1"/>
+      <w:r>
+        <w:rPr>
+          <w:rFonts w:ascii="Google Sans Text;sans-serif" w:hAnsi="Google Sans Text;sans-serif"/>
+          <w:b/>
+        </w:rPr>
+        <w:t>Interacting with APIs:</w:t>
+      </w:r>
+      <w:r>
+        <w:rPr>
+          <w:rFonts w:ascii="Google Sans Text;sans-serif" w:hAnsi="Google Sans Text;sans-serif"/>
+        </w:rPr>
+        <w:t xml:space="preserve"> It is the standard tool for developers and security researchers to test REST APIs. You can easily send GET, POST, PUT, and DELETE requests to see how a server responds.</w:t>
+      </w:r>
+    </w:p>
+    <w:p>
+      <w:pPr>
+        <w:pStyle w:val="BodyText"/>
+        <w:numPr>
+          <w:ilvl w:val="0"/>
+          <w:numId w:val="17"/>
+        </w:numPr>
+        <w:pBdr/>
+        <w:tabs>
+          <w:tab w:val="clear" w:pos="709"/>
+          <w:tab w:val="left" w:pos="0" w:leader="none"/>
+        </w:tabs>
+        <w:spacing w:lineRule="auto" w:line="274" w:before="0" w:after="140"/>
+        <w:ind w:hanging="283" w:left="709" w:right="0"/>
+        <w:rPr/>
+      </w:pPr>
+      <w:r>
+        <w:rPr>
+          <w:rFonts w:ascii="Google Sans Text;sans-serif" w:hAnsi="Google Sans Text;sans-serif"/>
+          <w:b/>
+        </w:rPr>
+        <w:t>Downloading Files:</w:t>
+      </w:r>
+      <w:r>
+        <w:rPr>
+          <w:rFonts w:ascii="Google Sans Text;sans-serif" w:hAnsi="Google Sans Text;sans-serif"/>
+        </w:rPr>
+        <w:t xml:space="preserve"> Similar to </w:t>
+      </w:r>
+      <w:r>
+        <w:rPr>
+          <w:rStyle w:val="SourceText"/>
+          <w:rFonts w:ascii="Google Sans Text;sans-serif" w:hAnsi="Google Sans Text;sans-serif"/>
+        </w:rPr>
+        <w:t>wget</w:t>
+      </w:r>
+      <w:r>
+        <w:rPr>
+          <w:rFonts w:ascii="Google Sans Text;sans-serif" w:hAnsi="Google Sans Text;sans-serif"/>
+        </w:rPr>
+        <w:t xml:space="preserve">, you can use </w:t>
+      </w:r>
+      <w:r>
+        <w:rPr>
+          <w:rStyle w:val="SourceText"/>
+          <w:rFonts w:ascii="Google Sans Text;sans-serif" w:hAnsi="Google Sans Text;sans-serif"/>
+        </w:rPr>
+        <w:t>curl</w:t>
+      </w:r>
+      <w:r>
+        <w:rPr>
+          <w:rFonts w:ascii="Google Sans Text;sans-serif" w:hAnsi="Google Sans Text;sans-serif"/>
+        </w:rPr>
+        <w:t xml:space="preserve"> to download files directly from the command line.</w:t>
+      </w:r>
+    </w:p>
+    <w:p>
+      <w:pPr>
+        <w:pStyle w:val="BodyText"/>
+        <w:numPr>
+          <w:ilvl w:val="0"/>
+          <w:numId w:val="17"/>
+        </w:numPr>
+        <w:pBdr/>
+        <w:tabs>
+          <w:tab w:val="clear" w:pos="709"/>
+          <w:tab w:val="left" w:pos="0" w:leader="none"/>
+        </w:tabs>
+        <w:spacing w:lineRule="auto" w:line="274" w:before="0" w:after="140"/>
+        <w:ind w:hanging="283" w:left="709" w:right="0"/>
+        <w:rPr>
+          <w:rFonts w:ascii="Google Sans Text;sans-serif" w:hAnsi="Google Sans Text;sans-serif"/>
+        </w:rPr>
+      </w:pPr>
+      <w:r>
+        <w:rPr>
+          <w:rFonts w:ascii="Google Sans Text;sans-serif" w:hAnsi="Google Sans Text;sans-serif"/>
+          <w:b/>
+        </w:rPr>
+        <w:t>Inspecting HTTP Headers:</w:t>
+      </w:r>
+      <w:r>
+        <w:rPr>
+          <w:rFonts w:ascii="Google Sans Text;sans-serif" w:hAnsi="Google Sans Text;sans-serif"/>
+        </w:rPr>
+        <w:t xml:space="preserve"> It allows you to view the hidden headers a server sends back (like server version, cookies, and security configurations), which is crucial for web enumeration and penetration testing.</w:t>
+      </w:r>
+    </w:p>
+    <w:p>
+      <w:pPr>
+        <w:pStyle w:val="BodyText"/>
+        <w:numPr>
+          <w:ilvl w:val="0"/>
+          <w:numId w:val="17"/>
+        </w:numPr>
+        <w:pBdr/>
+        <w:tabs>
+          <w:tab w:val="clear" w:pos="709"/>
+          <w:tab w:val="left" w:pos="0" w:leader="none"/>
+        </w:tabs>
+        <w:spacing w:lineRule="auto" w:line="274" w:before="0" w:after="140"/>
+        <w:ind w:hanging="283" w:left="709" w:right="0"/>
+        <w:rPr>
+          <w:rFonts w:ascii="Google Sans Text;sans-serif" w:hAnsi="Google Sans Text;sans-serif"/>
+        </w:rPr>
+      </w:pPr>
+      <w:bookmarkStart w:id="2" w:name="p-rc_669a3282ae64586a-25"/>
+      <w:bookmarkEnd w:id="2"/>
+      <w:r>
+        <w:rPr>
+          <w:rFonts w:ascii="Google Sans Text;sans-serif" w:hAnsi="Google Sans Text;sans-serif"/>
+          <w:b/>
+        </w:rPr>
+        <w:t>Testing Connectivity:</w:t>
+      </w:r>
+      <w:r>
+        <w:rPr>
+          <w:rFonts w:ascii="Google Sans Text;sans-serif" w:hAnsi="Google Sans Text;sans-serif"/>
+        </w:rPr>
+        <w:t xml:space="preserve"> It's a quick way to check if a web server is up and running, or if a firewall is blocking your connection.</w:t>
+      </w:r>
+    </w:p>
+    <w:p>
+      <w:pPr>
+        <w:pStyle w:val="HorizontalLine"/>
+        <w:spacing w:before="0" w:after="0"/>
+        <w:rPr>
+          <w:sz w:val="24"/>
+          <w:szCs w:val="24"/>
+        </w:rPr>
+      </w:pPr>
+      <w:r>
+        <w:rPr>
+          <w:sz w:val="24"/>
+          <w:szCs w:val="24"/>
+        </w:rPr>
+      </w:r>
+    </w:p>
+    <w:p>
+      <w:pPr>
+        <w:pStyle w:val="Heading3"/>
+        <w:spacing w:lineRule="auto" w:line="274" w:before="0" w:after="120"/>
+        <w:ind w:hanging="0" w:left="0" w:right="0"/>
+        <w:rPr>
+          <w:rFonts w:eastAsia="Noto Serif CJK SC"/>
+          <w:sz w:val="24"/>
+          <w:szCs w:val="24"/>
+        </w:rPr>
+      </w:pPr>
+      <w:r>
+        <w:rPr>
+          <w:rFonts w:eastAsia="Noto Serif CJK SC" w:ascii="Google Sans;sans-serif" w:hAnsi="Google Sans;sans-serif"/>
+          <w:sz w:val="24"/>
+          <w:szCs w:val="24"/>
+        </w:rPr>
+        <w:t xml:space="preserve">Common </w:t>
+      </w:r>
+      <w:r>
+        <w:rPr>
+          <w:rStyle w:val="SourceText"/>
+          <w:rFonts w:ascii="Google Sans Text;sans-serif" w:hAnsi="Google Sans Text;sans-serif"/>
+          <w:sz w:val="24"/>
+          <w:szCs w:val="24"/>
+        </w:rPr>
+        <w:t>curl</w:t>
+      </w:r>
+      <w:r>
+        <w:rPr>
+          <w:rFonts w:eastAsia="Noto Serif CJK SC" w:ascii="Google Sans;sans-serif" w:hAnsi="Google Sans;sans-serif"/>
+          <w:sz w:val="24"/>
+          <w:szCs w:val="24"/>
+        </w:rPr>
+        <w:t xml:space="preserve"> Commands for Beginners</w:t>
+      </w:r>
+    </w:p>
+    <w:p>
+      <w:pPr>
+        <w:pStyle w:val="BodyText"/>
+        <w:spacing w:lineRule="auto" w:line="274" w:before="0" w:after="140"/>
+        <w:ind w:hanging="0" w:left="0" w:right="0"/>
+        <w:rPr>
+          <w:rFonts w:ascii="Google Sans Text;sans-serif" w:hAnsi="Google Sans Text;sans-serif"/>
+        </w:rPr>
+      </w:pPr>
+      <w:r>
+        <w:rPr>
+          <w:rFonts w:ascii="Google Sans Text;sans-serif" w:hAnsi="Google Sans Text;sans-serif"/>
+        </w:rPr>
+        <w:t>Here are a few basic ways to use it:</w:t>
+      </w:r>
+    </w:p>
+    <w:p>
+      <w:pPr>
+        <w:pStyle w:val="BodyText"/>
+        <w:spacing w:lineRule="auto" w:line="274" w:before="0" w:after="140"/>
+        <w:ind w:hanging="0" w:left="0" w:right="0"/>
+        <w:rPr>
+          <w:rFonts w:ascii="Google Sans Text;sans-serif" w:hAnsi="Google Sans Text;sans-serif"/>
+          <w:b/>
+        </w:rPr>
+      </w:pPr>
+      <w:r>
+        <w:rPr>
+          <w:rFonts w:ascii="Google Sans Text;sans-serif" w:hAnsi="Google Sans Text;sans-serif"/>
+          <w:b/>
+        </w:rPr>
+        <w:t>1. Fetching a webpage's raw HTML:</w:t>
+      </w:r>
+    </w:p>
+    <w:p>
+      <w:pPr>
+        <w:pStyle w:val="BodyText"/>
+        <w:spacing w:lineRule="auto" w:line="274" w:before="0" w:after="140"/>
+        <w:ind w:hanging="0" w:left="0" w:right="0"/>
+        <w:rPr/>
+      </w:pPr>
+      <w:r>
+        <w:rPr>
+          <w:rFonts w:ascii="Google Sans Text;sans-serif" w:hAnsi="Google Sans Text;sans-serif"/>
+        </w:rPr>
+        <w:t xml:space="preserve">Just type </w:t>
+      </w:r>
+      <w:r>
+        <w:rPr>
+          <w:rStyle w:val="SourceText"/>
+          <w:rFonts w:ascii="Google Sans Text;sans-serif" w:hAnsi="Google Sans Text;sans-serif"/>
+        </w:rPr>
+        <w:t>curl</w:t>
+      </w:r>
+      <w:r>
+        <w:rPr>
+          <w:rFonts w:ascii="Google Sans Text;sans-serif" w:hAnsi="Google Sans Text;sans-serif"/>
+        </w:rPr>
+        <w:t xml:space="preserve"> followed by the URL.</w:t>
+      </w:r>
+    </w:p>
+    <w:p>
+      <w:pPr>
+        <w:pStyle w:val="BodyText"/>
+        <w:spacing w:lineRule="auto" w:line="274" w:before="0" w:after="140"/>
+        <w:ind w:hanging="0" w:left="0" w:right="0"/>
+        <w:rPr>
+          <w:rFonts w:ascii="Google Sans Text;sans-serif" w:hAnsi="Google Sans Text;sans-serif"/>
+        </w:rPr>
+      </w:pPr>
+      <w:r>
+        <w:rPr>
+          <w:rFonts w:ascii="Google Sans Text;sans-serif" w:hAnsi="Google Sans Text;sans-serif"/>
+        </w:rPr>
+        <w:t>Bash</w:t>
+      </w:r>
+    </w:p>
+    <w:p>
+      <w:pPr>
+        <w:pStyle w:val="PreformattedText"/>
+        <w:spacing w:lineRule="auto" w:line="274" w:before="0" w:after="0"/>
+        <w:ind w:hanging="0" w:left="0" w:right="0"/>
+        <w:rPr>
+          <w:rFonts w:ascii="Liberation Serif" w:hAnsi="Liberation Serif" w:eastAsia="Noto Serif CJK SC" w:cs="FreeSans"/>
+          <w:sz w:val="24"/>
+          <w:szCs w:val="24"/>
+        </w:rPr>
+      </w:pPr>
+      <w:r>
+        <w:rPr>
+          <w:rStyle w:val="SourceText"/>
+          <w:rFonts w:ascii="Google Sans Text;sans-serif" w:hAnsi="Google Sans Text;sans-serif"/>
+          <w:sz w:val="24"/>
+          <w:szCs w:val="24"/>
+        </w:rPr>
+        <w:t>curl http://www.example.com</w:t>
+      </w:r>
+    </w:p>
+    <w:p>
+      <w:pPr>
+        <w:pStyle w:val="BodyText"/>
+        <w:spacing w:lineRule="auto" w:line="274" w:before="0" w:after="140"/>
+        <w:ind w:hanging="0" w:left="0" w:right="0"/>
+        <w:rPr>
+          <w:rFonts w:ascii="Google Sans Text;sans-serif" w:hAnsi="Google Sans Text;sans-serif"/>
+          <w:b/>
+        </w:rPr>
+      </w:pPr>
+      <w:r>
+        <w:rPr>
+          <w:rFonts w:ascii="Google Sans Text;sans-serif" w:hAnsi="Google Sans Text;sans-serif"/>
+          <w:b/>
+        </w:rPr>
+        <w:t>2. Downloading a file:</w:t>
+      </w:r>
+    </w:p>
+    <w:p>
+      <w:pPr>
+        <w:pStyle w:val="BodyText"/>
+        <w:spacing w:lineRule="auto" w:line="274" w:before="0" w:after="140"/>
+        <w:ind w:hanging="0" w:left="0" w:right="0"/>
+        <w:rPr/>
+      </w:pPr>
+      <w:r>
+        <w:rPr>
+          <w:rFonts w:ascii="Google Sans Text;sans-serif" w:hAnsi="Google Sans Text;sans-serif"/>
+        </w:rPr>
+        <w:t xml:space="preserve">Use the uppercase </w:t>
+      </w:r>
+      <w:r>
+        <w:rPr>
+          <w:rStyle w:val="SourceText"/>
+          <w:rFonts w:ascii="Google Sans Text;sans-serif" w:hAnsi="Google Sans Text;sans-serif"/>
+        </w:rPr>
+        <w:t>-O</w:t>
+      </w:r>
+      <w:r>
+        <w:rPr>
+          <w:rFonts w:ascii="Google Sans Text;sans-serif" w:hAnsi="Google Sans Text;sans-serif"/>
+        </w:rPr>
+        <w:t xml:space="preserve"> flag to save the output to a file with the same name as it has on the server.</w:t>
+      </w:r>
+    </w:p>
+    <w:p>
+      <w:pPr>
+        <w:pStyle w:val="BodyText"/>
+        <w:spacing w:lineRule="auto" w:line="274" w:before="0" w:after="140"/>
+        <w:ind w:hanging="0" w:left="0" w:right="0"/>
+        <w:rPr>
+          <w:rFonts w:ascii="Google Sans Text;sans-serif" w:hAnsi="Google Sans Text;sans-serif"/>
+        </w:rPr>
+      </w:pPr>
+      <w:r>
+        <w:rPr>
+          <w:rFonts w:ascii="Google Sans Text;sans-serif" w:hAnsi="Google Sans Text;sans-serif"/>
+        </w:rPr>
+        <w:t>Bash</w:t>
+      </w:r>
+    </w:p>
+    <w:p>
+      <w:pPr>
+        <w:pStyle w:val="PreformattedText"/>
+        <w:spacing w:lineRule="auto" w:line="274" w:before="0" w:after="0"/>
+        <w:ind w:hanging="0" w:left="0" w:right="0"/>
+        <w:rPr>
+          <w:rFonts w:ascii="Liberation Serif" w:hAnsi="Liberation Serif" w:eastAsia="Noto Serif CJK SC" w:cs="FreeSans"/>
+          <w:sz w:val="24"/>
+          <w:szCs w:val="24"/>
+        </w:rPr>
+      </w:pPr>
+      <w:r>
+        <w:rPr>
+          <w:rStyle w:val="SourceText"/>
+          <w:rFonts w:ascii="Google Sans Text;sans-serif" w:hAnsi="Google Sans Text;sans-serif"/>
+          <w:sz w:val="24"/>
+          <w:szCs w:val="24"/>
+        </w:rPr>
+        <w:t>curl -O http://www.example.com/somefile.txt</w:t>
+      </w:r>
+    </w:p>
+    <w:p>
+      <w:pPr>
+        <w:pStyle w:val="BodyText"/>
+        <w:spacing w:lineRule="auto" w:line="274" w:before="0" w:after="140"/>
+        <w:ind w:hanging="0" w:left="0" w:right="0"/>
+        <w:rPr>
+          <w:rFonts w:ascii="Google Sans Text;sans-serif" w:hAnsi="Google Sans Text;sans-serif"/>
+          <w:b/>
+        </w:rPr>
+      </w:pPr>
+      <w:bookmarkStart w:id="3" w:name="p-rc_669a3282ae64586a-26"/>
+      <w:bookmarkEnd w:id="3"/>
+      <w:r>
+        <w:rPr>
+          <w:rFonts w:ascii="Google Sans Text;sans-serif" w:hAnsi="Google Sans Text;sans-serif"/>
+          <w:b/>
+        </w:rPr>
+        <w:t>3. Grabbing only the HTTP Headers:</w:t>
+      </w:r>
+    </w:p>
+    <w:p>
+      <w:pPr>
+        <w:pStyle w:val="BodyText"/>
+        <w:spacing w:lineRule="auto" w:line="274" w:before="0" w:after="140"/>
+        <w:ind w:hanging="0" w:left="0" w:right="0"/>
+        <w:rPr/>
+      </w:pPr>
+      <w:bookmarkStart w:id="4" w:name="p-rc_669a3282ae64586a-26_Copy_1"/>
+      <w:bookmarkEnd w:id="4"/>
+      <w:r>
+        <w:rPr>
+          <w:rFonts w:ascii="Google Sans Text;sans-serif" w:hAnsi="Google Sans Text;sans-serif"/>
+        </w:rPr>
+        <w:t xml:space="preserve">Use the uppercase </w:t>
+      </w:r>
+      <w:r>
+        <w:rPr>
+          <w:rStyle w:val="SourceText"/>
+          <w:rFonts w:ascii="Google Sans Text;sans-serif" w:hAnsi="Google Sans Text;sans-serif"/>
+        </w:rPr>
+        <w:t>-I</w:t>
+      </w:r>
+      <w:r>
+        <w:rPr>
+          <w:rFonts w:ascii="Google Sans Text;sans-serif" w:hAnsi="Google Sans Text;sans-serif"/>
+        </w:rPr>
+        <w:t xml:space="preserve"> flag. This is incredibly useful in CTFs (Capture The Flags) to quickly see what web server is running or to find hidden flags in the headers.</w:t>
+      </w:r>
+    </w:p>
+    <w:p>
+      <w:pPr>
+        <w:pStyle w:val="BodyText"/>
+        <w:spacing w:lineRule="auto" w:line="274" w:before="0" w:after="140"/>
+        <w:ind w:hanging="0" w:left="0" w:right="0"/>
+        <w:rPr>
+          <w:rFonts w:ascii="Google Sans Text;sans-serif" w:hAnsi="Google Sans Text;sans-serif"/>
+        </w:rPr>
+      </w:pPr>
+      <w:r>
+        <w:rPr>
+          <w:rFonts w:ascii="Google Sans Text;sans-serif" w:hAnsi="Google Sans Text;sans-serif"/>
+        </w:rPr>
+        <w:t>Bash</w:t>
+      </w:r>
+    </w:p>
+    <w:p>
+      <w:pPr>
+        <w:pStyle w:val="PreformattedText"/>
+        <w:spacing w:lineRule="auto" w:line="274" w:before="0" w:after="0"/>
+        <w:ind w:hanging="0" w:left="0" w:right="0"/>
+        <w:rPr>
+          <w:rFonts w:ascii="Liberation Serif" w:hAnsi="Liberation Serif" w:eastAsia="Noto Serif CJK SC" w:cs="FreeSans"/>
+          <w:sz w:val="24"/>
+          <w:szCs w:val="24"/>
+        </w:rPr>
+      </w:pPr>
+      <w:r>
+        <w:rPr>
+          <w:rStyle w:val="SourceText"/>
+          <w:rFonts w:ascii="Google Sans Text;sans-serif" w:hAnsi="Google Sans Text;sans-serif"/>
+          <w:sz w:val="24"/>
+          <w:szCs w:val="24"/>
+        </w:rPr>
+        <w:t>curl -I http://www.example.com</w:t>
+      </w:r>
+    </w:p>
+    <w:p>
+      <w:pPr>
+        <w:pStyle w:val="BodyText"/>
+        <w:spacing w:lineRule="auto" w:line="274" w:before="0" w:after="140"/>
+        <w:ind w:hanging="0" w:left="0" w:right="0"/>
+        <w:rPr/>
+      </w:pPr>
+      <w:r>
+        <w:rPr>
+          <w:rFonts w:ascii="Google Sans Text;sans-serif" w:hAnsi="Google Sans Text;sans-serif"/>
+          <w:i/>
+        </w:rPr>
+        <w:t xml:space="preserve">(This will return things like </w:t>
+      </w:r>
+      <w:r>
+        <w:rPr>
+          <w:rStyle w:val="SourceText"/>
+          <w:rFonts w:ascii="Google Sans Text;sans-serif" w:hAnsi="Google Sans Text;sans-serif"/>
+          <w:i/>
+        </w:rPr>
+        <w:t>HTTP/1.1 200 OK</w:t>
+      </w:r>
+      <w:r>
+        <w:rPr>
+          <w:rFonts w:ascii="Google Sans Text;sans-serif" w:hAnsi="Google Sans Text;sans-serif"/>
+          <w:i/>
+        </w:rPr>
+        <w:t xml:space="preserve">, </w:t>
+      </w:r>
+      <w:r>
+        <w:rPr>
+          <w:rStyle w:val="SourceText"/>
+          <w:rFonts w:ascii="Google Sans Text;sans-serif" w:hAnsi="Google Sans Text;sans-serif"/>
+          <w:i/>
+        </w:rPr>
+        <w:t>Server: Apache/2.4.41</w:t>
+      </w:r>
+      <w:r>
+        <w:rPr>
+          <w:rFonts w:ascii="Google Sans Text;sans-serif" w:hAnsi="Google Sans Text;sans-serif"/>
+          <w:i/>
+        </w:rPr>
+        <w:t>, etc.)</w:t>
+      </w:r>
+    </w:p>
+    <w:p>
+      <w:pPr>
+        <w:pStyle w:val="BodyText"/>
+        <w:spacing w:lineRule="auto" w:line="274" w:before="0" w:after="140"/>
+        <w:ind w:hanging="0" w:left="0" w:right="0"/>
+        <w:rPr>
+          <w:rFonts w:ascii="Google Sans Text;sans-serif" w:hAnsi="Google Sans Text;sans-serif"/>
+          <w:b/>
+        </w:rPr>
+      </w:pPr>
+      <w:r>
+        <w:rPr>
+          <w:rFonts w:ascii="Google Sans Text;sans-serif" w:hAnsi="Google Sans Text;sans-serif"/>
+          <w:b/>
+        </w:rPr>
+        <w:t>4. Ignoring SSL Certificate warnings:</w:t>
+      </w:r>
+    </w:p>
+    <w:p>
+      <w:pPr>
+        <w:pStyle w:val="BodyText"/>
+        <w:spacing w:lineRule="auto" w:line="274" w:before="0" w:after="140"/>
+        <w:ind w:hanging="0" w:left="0" w:right="0"/>
+        <w:rPr/>
+      </w:pPr>
+      <w:r>
+        <w:rPr>
+          <w:rFonts w:ascii="Google Sans Text;sans-serif" w:hAnsi="Google Sans Text;sans-serif"/>
+        </w:rPr>
+        <w:t xml:space="preserve">If you are testing a target with a self-signed or expired HTTPS certificate, </w:t>
+      </w:r>
+      <w:r>
+        <w:rPr>
+          <w:rStyle w:val="SourceText"/>
+          <w:rFonts w:ascii="Google Sans Text;sans-serif" w:hAnsi="Google Sans Text;sans-serif"/>
+        </w:rPr>
+        <w:t>curl</w:t>
+      </w:r>
+      <w:r>
+        <w:rPr>
+          <w:rFonts w:ascii="Google Sans Text;sans-serif" w:hAnsi="Google Sans Text;sans-serif"/>
+        </w:rPr>
+        <w:t xml:space="preserve"> will block the request. You can bypass this using the </w:t>
+      </w:r>
+      <w:r>
+        <w:rPr>
+          <w:rStyle w:val="SourceText"/>
+          <w:rFonts w:ascii="Google Sans Text;sans-serif" w:hAnsi="Google Sans Text;sans-serif"/>
+        </w:rPr>
+        <w:t>-k</w:t>
+      </w:r>
+      <w:r>
+        <w:rPr>
+          <w:rFonts w:ascii="Google Sans Text;sans-serif" w:hAnsi="Google Sans Text;sans-serif"/>
+        </w:rPr>
+        <w:t xml:space="preserve"> flag (just like in Gobuster).</w:t>
+      </w:r>
+    </w:p>
+    <w:p>
+      <w:pPr>
+        <w:pStyle w:val="BodyText"/>
+        <w:spacing w:lineRule="auto" w:line="274" w:before="0" w:after="140"/>
+        <w:ind w:hanging="0" w:left="0" w:right="0"/>
+        <w:rPr>
+          <w:rFonts w:ascii="Google Sans Text;sans-serif" w:hAnsi="Google Sans Text;sans-serif"/>
+        </w:rPr>
+      </w:pPr>
+      <w:r>
+        <w:rPr>
+          <w:rFonts w:ascii="Google Sans Text;sans-serif" w:hAnsi="Google Sans Text;sans-serif"/>
+        </w:rPr>
+        <w:t>Bash</w:t>
+      </w:r>
+    </w:p>
+    <w:p>
+      <w:pPr>
+        <w:pStyle w:val="PreformattedText"/>
+        <w:spacing w:lineRule="auto" w:line="274" w:before="0" w:after="0"/>
+        <w:ind w:hanging="0" w:left="0" w:right="0"/>
+        <w:rPr>
+          <w:rFonts w:ascii="Liberation Serif" w:hAnsi="Liberation Serif" w:eastAsia="Noto Serif CJK SC" w:cs="FreeSans"/>
+          <w:sz w:val="24"/>
+          <w:szCs w:val="24"/>
+        </w:rPr>
+      </w:pPr>
+      <w:r>
+        <w:rPr>
+          <w:rStyle w:val="SourceText"/>
+          <w:rFonts w:ascii="Google Sans Text;sans-serif" w:hAnsi="Google Sans Text;sans-serif"/>
+          <w:sz w:val="24"/>
+          <w:szCs w:val="24"/>
+        </w:rPr>
+        <w:t>curl -k https://10.10.10.10</w:t>
+      </w:r>
+    </w:p>
     <w:p>
       <w:pPr>
         <w:pStyle w:val="Normal"/>
@@ -4679,7 +5466,143 @@
   <w:abstractNum w:abstractNumId="17">
     <w:lvl w:ilvl="0">
       <w:start w:val="1"/>
-      <w:pStyle w:val="Heading1"/>
+      <w:numFmt w:val="bullet"/>
+      <w:lvlText w:val=""/>
+      <w:lvlJc w:val="left"/>
+      <w:pPr>
+        <w:tabs>
+          <w:tab w:val="num" w:pos="709"/>
+        </w:tabs>
+        <w:ind w:left="709" w:hanging="283"/>
+      </w:pPr>
+      <w:rPr>
+        <w:rFonts w:ascii="Symbol" w:hAnsi="Symbol" w:cs="Symbol" w:hint="default"/>
+      </w:rPr>
+    </w:lvl>
+    <w:lvl w:ilvl="1">
+      <w:start w:val="1"/>
+      <w:numFmt w:val="bullet"/>
+      <w:lvlText w:val=""/>
+      <w:lvlJc w:val="left"/>
+      <w:pPr>
+        <w:tabs>
+          <w:tab w:val="num" w:pos="1418"/>
+        </w:tabs>
+        <w:ind w:left="1418" w:hanging="283"/>
+      </w:pPr>
+      <w:rPr>
+        <w:rFonts w:ascii="Symbol" w:hAnsi="Symbol" w:cs="Symbol" w:hint="default"/>
+      </w:rPr>
+    </w:lvl>
+    <w:lvl w:ilvl="2">
+      <w:start w:val="1"/>
+      <w:numFmt w:val="bullet"/>
+      <w:lvlText w:val=""/>
+      <w:lvlJc w:val="left"/>
+      <w:pPr>
+        <w:tabs>
+          <w:tab w:val="num" w:pos="2127"/>
+        </w:tabs>
+        <w:ind w:left="2127" w:hanging="283"/>
+      </w:pPr>
+      <w:rPr>
+        <w:rFonts w:ascii="Symbol" w:hAnsi="Symbol" w:cs="Symbol" w:hint="default"/>
+      </w:rPr>
+    </w:lvl>
+    <w:lvl w:ilvl="3">
+      <w:start w:val="1"/>
+      <w:numFmt w:val="bullet"/>
+      <w:lvlText w:val=""/>
+      <w:lvlJc w:val="left"/>
+      <w:pPr>
+        <w:tabs>
+          <w:tab w:val="num" w:pos="2836"/>
+        </w:tabs>
+        <w:ind w:left="2836" w:hanging="283"/>
+      </w:pPr>
+      <w:rPr>
+        <w:rFonts w:ascii="Symbol" w:hAnsi="Symbol" w:cs="Symbol" w:hint="default"/>
+      </w:rPr>
+    </w:lvl>
+    <w:lvl w:ilvl="4">
+      <w:start w:val="1"/>
+      <w:numFmt w:val="bullet"/>
+      <w:lvlText w:val=""/>
+      <w:lvlJc w:val="left"/>
+      <w:pPr>
+        <w:tabs>
+          <w:tab w:val="num" w:pos="3545"/>
+        </w:tabs>
+        <w:ind w:left="3545" w:hanging="283"/>
+      </w:pPr>
+      <w:rPr>
+        <w:rFonts w:ascii="Symbol" w:hAnsi="Symbol" w:cs="Symbol" w:hint="default"/>
+      </w:rPr>
+    </w:lvl>
+    <w:lvl w:ilvl="5">
+      <w:start w:val="1"/>
+      <w:numFmt w:val="bullet"/>
+      <w:lvlText w:val=""/>
+      <w:lvlJc w:val="left"/>
+      <w:pPr>
+        <w:tabs>
+          <w:tab w:val="num" w:pos="4254"/>
+        </w:tabs>
+        <w:ind w:left="4254" w:hanging="283"/>
+      </w:pPr>
+      <w:rPr>
+        <w:rFonts w:ascii="Symbol" w:hAnsi="Symbol" w:cs="Symbol" w:hint="default"/>
+      </w:rPr>
+    </w:lvl>
+    <w:lvl w:ilvl="6">
+      <w:start w:val="1"/>
+      <w:numFmt w:val="bullet"/>
+      <w:lvlText w:val=""/>
+      <w:lvlJc w:val="left"/>
+      <w:pPr>
+        <w:tabs>
+          <w:tab w:val="num" w:pos="4963"/>
+        </w:tabs>
+        <w:ind w:left="4963" w:hanging="283"/>
+      </w:pPr>
+      <w:rPr>
+        <w:rFonts w:ascii="Symbol" w:hAnsi="Symbol" w:cs="Symbol" w:hint="default"/>
+      </w:rPr>
+    </w:lvl>
+    <w:lvl w:ilvl="7">
+      <w:start w:val="1"/>
+      <w:numFmt w:val="bullet"/>
+      <w:lvlText w:val=""/>
+      <w:lvlJc w:val="left"/>
+      <w:pPr>
+        <w:tabs>
+          <w:tab w:val="num" w:pos="5672"/>
+        </w:tabs>
+        <w:ind w:left="5672" w:hanging="283"/>
+      </w:pPr>
+      <w:rPr>
+        <w:rFonts w:ascii="Symbol" w:hAnsi="Symbol" w:cs="Symbol" w:hint="default"/>
+      </w:rPr>
+    </w:lvl>
+    <w:lvl w:ilvl="8">
+      <w:start w:val="1"/>
+      <w:numFmt w:val="bullet"/>
+      <w:lvlText w:val=""/>
+      <w:lvlJc w:val="left"/>
+      <w:pPr>
+        <w:tabs>
+          <w:tab w:val="num" w:pos="6381"/>
+        </w:tabs>
+        <w:ind w:left="6381" w:hanging="283"/>
+      </w:pPr>
+      <w:rPr>
+        <w:rFonts w:ascii="Symbol" w:hAnsi="Symbol" w:cs="Symbol" w:hint="default"/>
+      </w:rPr>
+    </w:lvl>
+  </w:abstractNum>
+  <w:abstractNum w:abstractNumId="18">
+    <w:lvl w:ilvl="0">
+      <w:start w:val="1"/>
       <w:numFmt w:val="none"/>
       <w:suff w:val="nothing"/>
       <w:lvlText w:val=""/>
@@ -4693,7 +5616,6 @@
     </w:lvl>
     <w:lvl w:ilvl="1">
       <w:start w:val="1"/>
-      <w:pStyle w:val="Heading2"/>
       <w:numFmt w:val="none"/>
       <w:suff w:val="nothing"/>
       <w:lvlText w:val=""/>
@@ -4708,6 +5630,7 @@
     <w:lvl w:ilvl="2">
       <w:start w:val="1"/>
       <w:numFmt w:val="none"/>
+      <w:pStyle w:val="Heading3"/>
       <w:suff w:val="nothing"/>
       <w:lvlText w:val=""/>
       <w:lvlJc w:val="left"/>
@@ -4848,6 +5771,9 @@
   <w:num w:numId="17">
     <w:abstractNumId w:val="17"/>
   </w:num>
+  <w:num w:numId="18">
+    <w:abstractNumId w:val="18"/>
+  </w:num>
 </w:numbering>
 </file>
 
@@ -4889,7 +5815,7 @@
     </w:rPr>
   </w:style>
   <w:style w:type="paragraph" w:styleId="Heading1">
-    <w:name w:val="Heading 1"/>
+    <w:name w:val="heading 1"/>
     <w:basedOn w:val="Heading"/>
     <w:next w:val="BodyText"/>
     <w:qFormat/>
@@ -4906,7 +5832,7 @@
     </w:rPr>
   </w:style>
   <w:style w:type="paragraph" w:styleId="Heading2">
-    <w:name w:val="Heading 2"/>
+    <w:name w:val="heading 2"/>
     <w:basedOn w:val="Heading"/>
     <w:next w:val="BodyText"/>
     <w:qFormat/>
@@ -4922,6 +5848,23 @@
       <w:szCs w:val="36"/>
     </w:rPr>
   </w:style>
+  <w:style w:type="paragraph" w:styleId="Heading3">
+    <w:name w:val="heading 3"/>
+    <w:basedOn w:val="Heading"/>
+    <w:next w:val="BodyText"/>
+    <w:qFormat/>
+    <w:pPr>
+      <w:spacing w:before="140" w:after="120"/>
+      <w:outlineLvl w:val="2"/>
+    </w:pPr>
+    <w:rPr>
+      <w:rFonts w:ascii="Liberation Serif" w:hAnsi="Liberation Serif" w:eastAsia="Noto Sans" w:cs="FreeSans"/>
+      <w:b/>
+      <w:bCs/>
+      <w:sz w:val="28"/>
+      <w:szCs w:val="28"/>
+    </w:rPr>
+  </w:style>
   <w:style w:type="character" w:styleId="Strong">
     <w:name w:val="Strong"/>
     <w:qFormat/>
@@ -4930,8 +5873,8 @@
       <w:bCs/>
     </w:rPr>
   </w:style>
-  <w:style w:type="character" w:styleId="Bullets">
-    <w:name w:val="Bullets"/>
+  <w:style w:type="character" w:styleId="Bulletsuser">
+    <w:name w:val="Bullets (user)"/>
     <w:qFormat/>
     <w:rPr>
       <w:rFonts w:ascii="OpenSymbol" w:hAnsi="OpenSymbol" w:eastAsia="OpenSymbol" w:cs="OpenSymbol"/>
@@ -4942,6 +5885,13 @@
     <w:qFormat/>
     <w:rPr>
       <w:rFonts w:ascii="Liberation Mono" w:hAnsi="Liberation Mono" w:eastAsia="Noto Sans Mono CJK SC" w:cs="Liberation Mono"/>
+    </w:rPr>
+  </w:style>
+  <w:style w:type="character" w:styleId="Bullets">
+    <w:name w:val="Bullets"/>
+    <w:qFormat/>
+    <w:rPr>
+      <w:rFonts w:ascii="OpenSymbol" w:hAnsi="OpenSymbol" w:eastAsia="OpenSymbol" w:cs="OpenSymbol"/>
     </w:rPr>
   </w:style>
   <w:style w:type="paragraph" w:styleId="Heading">
@@ -4976,7 +5926,7 @@
     </w:rPr>
   </w:style>
   <w:style w:type="paragraph" w:styleId="Caption">
-    <w:name w:val="Caption"/>
+    <w:name w:val="caption"/>
     <w:basedOn w:val="Normal"/>
     <w:qFormat/>
     <w:pPr>

</xml_diff>